<commit_message>
Add leader thumbnail upload; normalize External Website URLs
- New netlify/functions/leader-upload-thumbnail.js wraps Airtable's
  content-upload endpoint with the same email-match auth as
  leader-update.js. JPEG/PNG/WebP only, 5 MB cap. Token stays
  server-side. Inline photo-policy reminder on the form.

- admin-leader.html: file input wired to ClubsAPI.leaderUploadThumbnail.
  Independent of the main form save — file change triggers immediate
  upload with status feedback. Also prefixes https:// on pre-populated
  External Website values that lack a scheme so the url-input
  validator doesn't reject them on save.

- api-client.js: leaderUploadThumbnail() helper.

- styles.css: .field-hint style for inline policy text.

- CLAUDE.md: list the new function in the layout block.

Co-Authored-By: Claude Opus 4.7 <noreply@anthropic.com>
</commit_message>
<xml_diff>
--- a/CLAUDE.docx
+++ b/CLAUDE.docx
@@ -659,6 +659,15 @@
           <w:rStyle w:val="VerbatimChar"/>
         </w:rPr>
         <w:t xml:space="preserve">  leader-update.js</w:t>
+      </w:r>
+      <w:r>
+        <w:br/>
+      </w:r>
+      <w:r>
+        <w:rPr>
+          <w:rStyle w:val="VerbatimChar"/>
+        </w:rPr>
+        <w:t xml:space="preserve">  leader-upload-thumbnail.js</w:t>
       </w:r>
     </w:p>
     <w:bookmarkEnd w:id="11"/>

</xml_diff>